<commit_message>
fix: align Mphasis resume to Trainee Software Engineer role - fix summary, skills, remove fake certs
</commit_message>
<xml_diff>
--- a/Resume/Navneet_Vishwakarma_Mphasis_Trainee_SE.docx
+++ b/Resume/Navneet_Vishwakarma_Mphasis_Trainee_SE.docx
@@ -31,7 +31,7 @@
           <w:color w:val="555555"/>
           <w:sz w:val="17"/>
         </w:rPr>
-        <w:t>Operations Support  |  Process Monitoring  |  Documentation  |  Data Management</w:t>
+        <w:t>Technical Support  |  System Operations  |  Troubleshooting  |  Documentation</w:t>
       </w:r>
     </w:p>
     <w:p>
@@ -139,7 +139,7 @@
           <w:color w:val="2D2D2D"/>
           <w:sz w:val="18"/>
         </w:rPr>
-        <w:t>Detail-oriented Computer Science Engineering student with experience in operations support, process monitoring, documentation, troubleshooting, and administrative tasks. Proficient in Microsoft Excel, Microsoft Office, data management, reporting, and maintaining operational records. Strong communication skills with the ability to follow standard operating procedures, work in team environments, and support day-to-day operational activities. Seeking opportunities as Operator, Technician, Operations Associate, or Production Support Executive.</w:t>
+        <w:t>Computer Science Engineering student with experience in technical support, system operations, troubleshooting, documentation, and process management. Proficient in Linux environments, Microsoft Office, data analysis, and operational support activities. Strong problem-solving, communication, and collaboration skills with the ability to learn new technologies quickly and work effectively in team environments. Seeking opportunities as a Trainee Software Engineer, Systems Engineer, Technical Support Engineer, or Infrastructure Support Engineer.</w:t>
       </w:r>
     </w:p>
     <w:p>
@@ -164,6 +164,32 @@
           <w:bottom w:val="single" w:sz="8000" w:space="1" w:color="165390"/>
         </w:pBdr>
       </w:pPr>
+    </w:p>
+    <w:p>
+      <w:pPr>
+        <w:spacing w:before="20" w:after="20" w:line="230" w:lineRule="exact"/>
+        <w:ind w:left="144"/>
+      </w:pPr>
+      <w:r>
+        <w:rPr>
+          <w:rFonts w:ascii="Calibri" w:hAnsi="Calibri"/>
+          <w:b/>
+          <w:i w:val="0"/>
+          <w:color w:val="1A1A2E"/>
+          <w:sz w:val="18"/>
+        </w:rPr>
+        <w:t xml:space="preserve">Operating Systems:  </w:t>
+      </w:r>
+      <w:r>
+        <w:rPr>
+          <w:rFonts w:ascii="Calibri" w:hAnsi="Calibri"/>
+          <w:b w:val="0"/>
+          <w:i w:val="0"/>
+          <w:color w:val="2D2D2D"/>
+          <w:sz w:val="18"/>
+        </w:rPr>
+        <w:t>Linux, Windows</w:t>
+      </w:r>
     </w:p>
     <w:p>
       <w:pPr>
@@ -204,7 +230,7 @@
           <w:color w:val="1A1A2E"/>
           <w:sz w:val="18"/>
         </w:rPr>
-        <w:t xml:space="preserve">Data &amp; Documentation:  </w:t>
+        <w:t xml:space="preserve">Technical Support:  </w:t>
       </w:r>
       <w:r>
         <w:rPr>
@@ -214,7 +240,7 @@
           <w:color w:val="2D2D2D"/>
           <w:sz w:val="18"/>
         </w:rPr>
-        <w:t>Data Entry, Documentation, Reporting, Record Management</w:t>
+        <w:t>Troubleshooting, Issue Resolution, Documentation, Process Monitoring</w:t>
       </w:r>
     </w:p>
     <w:p>
@@ -230,7 +256,7 @@
           <w:color w:val="1A1A2E"/>
           <w:sz w:val="18"/>
         </w:rPr>
-        <w:t xml:space="preserve">Operations:  </w:t>
+        <w:t xml:space="preserve">Tools &amp; Technologies:  </w:t>
       </w:r>
       <w:r>
         <w:rPr>
@@ -240,7 +266,7 @@
           <w:color w:val="2D2D2D"/>
           <w:sz w:val="18"/>
         </w:rPr>
-        <w:t>Process Monitoring, Administrative Support, Basic Computer Operations</w:t>
+        <w:t>Git, Basic Shell Scripting, Microsoft Office</w:t>
       </w:r>
     </w:p>
     <w:p>
@@ -266,7 +292,7 @@
           <w:color w:val="2D2D2D"/>
           <w:sz w:val="18"/>
         </w:rPr>
-        <w:t>Communication, Team Collaboration, SOP Compliance, Issue Tracking &amp; Resolution</w:t>
+        <w:t>Communication, Team Collaboration, Problem Solving, SOP Compliance</w:t>
       </w:r>
     </w:p>
     <w:p>
@@ -702,7 +728,7 @@
           <w:color w:val="2D2D2D"/>
           <w:sz w:val="18"/>
         </w:rPr>
-        <w:t>Microsoft Office &amp; Excel Fundamentals</w:t>
+        <w:t>Linux Administration Training (CX-501) – Codenixia</w:t>
       </w:r>
     </w:p>
     <w:p>
@@ -728,7 +754,7 @@
           <w:color w:val="2D2D2D"/>
           <w:sz w:val="18"/>
         </w:rPr>
-        <w:t>Computer Applications &amp; Documentation Training</w:t>
+        <w:t>Linux Server Hardening &amp; Security Training (CX-701) – Codenixia</w:t>
       </w:r>
     </w:p>
     <w:p>
@@ -754,7 +780,7 @@
           <w:color w:val="2D2D2D"/>
           <w:sz w:val="18"/>
         </w:rPr>
-        <w:t>Linux Administration Training – Codenixia</w:t>
+        <w:t>SUSE Linux Enterprise Server (SLES) Administration Training</w:t>
       </w:r>
     </w:p>
     <w:p>

</xml_diff>